<commit_message>
Capteur S3 (pcb) : exports renommés Capteur_S3_*
Les exports EasyEDA de la carte S3 (projet .epro2, vues 2D et PCB,
schémas PDF, BOM) prennent les noms Capteur_S3_* ; les fiches CapteurS3,
Composants (S3) et CapteurC3Xiao citent les nouveaux noms.

Co-Authored-By: Claude Opus 5.5 <noreply@anthropic.com>
</commit_message>
<xml_diff>
--- a/Capteur/pcb/Capteur C3 Xiao/CapteurC3Xiao.docx
+++ b/Capteur/pcb/Capteur C3 Xiao/CapteurC3Xiao.docx
@@ -5531,8 +5531,8 @@
         </w:tblBorders>
       </w:tblPr>
       <w:tblGrid>
-        <w:gridCol w:w="386"/>
-        <w:gridCol w:w="9252"/>
+        <w:gridCol w:w="300"/>
+        <w:gridCol w:w="9338"/>
       </w:tblGrid>
       <w:tr>
         <w:trPr>
@@ -5540,7 +5540,7 @@
         </w:trPr>
         <w:tc>
           <w:tcPr>
-            <w:tcW w:type="dxa" w:w="386"/>
+            <w:tcW w:type="dxa" w:w="300"/>
             <w:tcBorders>
               <w:top w:val="single" w:color="999999" w:sz="4"/>
               <w:left w:val="single" w:color="999999" w:sz="4"/>
@@ -5567,7 +5567,7 @@
         </w:tc>
         <w:tc>
           <w:tcPr>
-            <w:tcW w:type="dxa" w:w="9252"/>
+            <w:tcW w:type="dxa" w:w="9338"/>
             <w:tcBorders>
               <w:top w:val="single" w:color="999999" w:sz="4"/>
               <w:left w:val="single" w:color="999999" w:sz="4"/>
@@ -5599,7 +5599,7 @@
         </w:trPr>
         <w:tc>
           <w:tcPr>
-            <w:tcW w:type="dxa" w:w="386"/>
+            <w:tcW w:type="dxa" w:w="300"/>
             <w:tcBorders>
               <w:top w:val="single" w:color="999999" w:sz="4"/>
               <w:left w:val="single" w:color="999999" w:sz="4"/>
@@ -5621,7 +5621,7 @@
         </w:tc>
         <w:tc>
           <w:tcPr>
-            <w:tcW w:type="dxa" w:w="9252"/>
+            <w:tcW w:type="dxa" w:w="9338"/>
             <w:tcBorders>
               <w:top w:val="single" w:color="999999" w:sz="4"/>
               <w:left w:val="single" w:color="999999" w:sz="4"/>
@@ -5638,6 +5638,17 @@
           <w:p>
             <w:r>
               <w:t xml:space="preserve">cloud « Capteur C3 Xiao » (copie par import de </w:t>
+            </w:r>
+            <w:r>
+              <w:rPr>
+                <w:rFonts w:ascii="Consolas" w:cs="Consolas" w:eastAsia="Consolas" w:hAnsi="Consolas"/>
+                <w:sz w:val="19"/>
+                <w:szCs w:val="19"/>
+              </w:rPr>
+              <w:t xml:space="preserve">Capteur_S3_Projet_2026-10-19.epro2</w:t>
+            </w:r>
+            <w:r>
+              <w:t xml:space="preserve">, alors nommé </w:t>
             </w:r>
             <w:r>
               <w:rPr>
@@ -5667,7 +5678,7 @@
         </w:trPr>
         <w:tc>
           <w:tcPr>
-            <w:tcW w:type="dxa" w:w="386"/>
+            <w:tcW w:type="dxa" w:w="300"/>
             <w:tcBorders>
               <w:top w:val="single" w:color="999999" w:sz="4"/>
               <w:left w:val="single" w:color="999999" w:sz="4"/>
@@ -5689,7 +5700,7 @@
         </w:tc>
         <w:tc>
           <w:tcPr>
-            <w:tcW w:type="dxa" w:w="9252"/>
+            <w:tcW w:type="dxa" w:w="9338"/>
             <w:tcBorders>
               <w:top w:val="single" w:color="999999" w:sz="4"/>
               <w:left w:val="single" w:color="999999" w:sz="4"/>
@@ -5716,7 +5727,7 @@
         </w:trPr>
         <w:tc>
           <w:tcPr>
-            <w:tcW w:type="dxa" w:w="386"/>
+            <w:tcW w:type="dxa" w:w="300"/>
             <w:tcBorders>
               <w:top w:val="single" w:color="999999" w:sz="4"/>
               <w:left w:val="single" w:color="999999" w:sz="4"/>
@@ -5738,7 +5749,7 @@
         </w:tc>
         <w:tc>
           <w:tcPr>
-            <w:tcW w:type="dxa" w:w="9252"/>
+            <w:tcW w:type="dxa" w:w="9338"/>
             <w:tcBorders>
               <w:top w:val="single" w:color="999999" w:sz="4"/>
               <w:left w:val="single" w:color="999999" w:sz="4"/>
@@ -5889,7 +5900,7 @@
         </w:numPr>
       </w:pPr>
       <w:r>
-        <w:t xml:space="preserve">☑ Export </w:t>
+        <w:t xml:space="preserve">[x] Export </w:t>
       </w:r>
       <w:r>
         <w:rPr>
@@ -5923,7 +5934,7 @@
         </w:numPr>
       </w:pPr>
       <w:r>
-        <w:t xml:space="preserve">☑ Commit du dossier de la carte (les modifications de code du § 1.2 ne sont pas commitées).</w:t>
+        <w:t xml:space="preserve">[x] Commit du dossier de la carte (les modifications de code du § 1.2 ne sont pas commitées).</w:t>
       </w:r>
     </w:p>
     <w:p>
@@ -5935,7 +5946,7 @@
         </w:numPr>
       </w:pPr>
       <w:r>
-        <w:t xml:space="preserve">☐ Commande JLCPCB.</w:t>
+        <w:t xml:space="preserve">[ ] Commande JLCPCB.</w:t>
       </w:r>
     </w:p>
     <w:p>
@@ -5947,7 +5958,7 @@
         </w:numPr>
       </w:pPr>
       <w:r>
-        <w:t xml:space="preserve">☐ Essais : démarrage avec cuve pleine, mesure des piles sur D2 (calibre 3,0), Wi-Fi à 19,5 dBm sur piles.</w:t>
+        <w:t xml:space="preserve">[ ] Essais : démarrage avec cuve pleine, mesure des piles sur D2 (calibre 3,0), Wi-Fi à 19,5 dBm sur piles.</w:t>
       </w:r>
     </w:p>
     <w:p>
@@ -5959,7 +5970,7 @@
         </w:numPr>
       </w:pPr>
       <w:r>
-        <w:t xml:space="preserve">☐ Boîtier imprimé.</w:t>
+        <w:t xml:space="preserve">[ ] Boîtier imprimé.</w:t>
       </w:r>
     </w:p>
     <w:p>
@@ -6307,6 +6318,139 @@
     <w:basedOn w:val="Normal"/>
     <w:qFormat/>
   </w:style>
+  <w:style w:type="paragraph" w:styleId="Caption">
+    <w:name w:val="caption"/>
+    <w:basedOn w:val="Normal"/>
+    <w:next w:val="Normal"/>
+    <w:uiPriority w:val="35"/>
+    <w:semiHidden/>
+    <w:unhideWhenUsed/>
+    <w:qFormat/>
+    <w:pPr>
+      <w:spacing w:after="200"/>
+    </w:pPr>
+    <w:rPr>
+      <w:i/>
+      <w:iCs/>
+      <w:color w:val="44546A" w:themeColor="dark2"/>
+      <w:sz w:val="18"/>
+      <w:szCs w:val="18"/>
+    </w:rPr>
+  </w:style>
+  <w:style w:type="paragraph" w:styleId="Bibliography">
+    <w:name w:val="Bibliography"/>
+    <w:basedOn w:val="Normal"/>
+    <w:next w:val="Normal"/>
+    <w:uiPriority w:val="37"/>
+    <w:unhideWhenUsed/>
+  </w:style>
+  <w:style w:type="paragraph" w:styleId="TOC1">
+    <w:name w:val="toc 1"/>
+    <w:basedOn w:val="Normal"/>
+    <w:next w:val="Normal"/>
+    <w:uiPriority w:val="39"/>
+    <w:semiHidden/>
+    <w:unhideWhenUsed/>
+    <w:pPr>
+      <w:spacing w:after="100"/>
+    </w:pPr>
+  </w:style>
+  <w:style w:type="paragraph" w:styleId="TOC2">
+    <w:name w:val="toc 2"/>
+    <w:basedOn w:val="Normal"/>
+    <w:next w:val="Normal"/>
+    <w:uiPriority w:val="39"/>
+    <w:semiHidden/>
+    <w:unhideWhenUsed/>
+    <w:pPr>
+      <w:spacing w:after="100"/>
+      <w:ind w:left="220"/>
+    </w:pPr>
+  </w:style>
+  <w:style w:type="paragraph" w:styleId="TOC3">
+    <w:name w:val="toc 3"/>
+    <w:basedOn w:val="Normal"/>
+    <w:next w:val="Normal"/>
+    <w:uiPriority w:val="39"/>
+    <w:semiHidden/>
+    <w:unhideWhenUsed/>
+    <w:pPr>
+      <w:spacing w:after="100"/>
+      <w:ind w:left="440"/>
+    </w:pPr>
+  </w:style>
+  <w:style w:type="paragraph" w:styleId="TOC4">
+    <w:name w:val="toc 4"/>
+    <w:basedOn w:val="Normal"/>
+    <w:next w:val="Normal"/>
+    <w:uiPriority w:val="39"/>
+    <w:semiHidden/>
+    <w:unhideWhenUsed/>
+    <w:pPr>
+      <w:spacing w:after="100"/>
+      <w:ind w:left="660"/>
+    </w:pPr>
+  </w:style>
+  <w:style w:type="paragraph" w:styleId="TOC5">
+    <w:name w:val="toc 5"/>
+    <w:basedOn w:val="Normal"/>
+    <w:next w:val="Normal"/>
+    <w:uiPriority w:val="39"/>
+    <w:semiHidden/>
+    <w:unhideWhenUsed/>
+    <w:pPr>
+      <w:spacing w:after="100"/>
+      <w:ind w:left="880"/>
+    </w:pPr>
+  </w:style>
+  <w:style w:type="paragraph" w:styleId="TOC6">
+    <w:name w:val="toc 6"/>
+    <w:basedOn w:val="Normal"/>
+    <w:next w:val="Normal"/>
+    <w:uiPriority w:val="39"/>
+    <w:semiHidden/>
+    <w:unhideWhenUsed/>
+    <w:pPr>
+      <w:spacing w:after="100"/>
+      <w:ind w:left="1100"/>
+    </w:pPr>
+  </w:style>
+  <w:style w:type="paragraph" w:styleId="TOC7">
+    <w:name w:val="toc 7"/>
+    <w:basedOn w:val="Normal"/>
+    <w:next w:val="Normal"/>
+    <w:uiPriority w:val="39"/>
+    <w:semiHidden/>
+    <w:unhideWhenUsed/>
+    <w:pPr>
+      <w:spacing w:after="100"/>
+      <w:ind w:left="1320"/>
+    </w:pPr>
+  </w:style>
+  <w:style w:type="paragraph" w:styleId="TOC8">
+    <w:name w:val="toc 8"/>
+    <w:basedOn w:val="Normal"/>
+    <w:next w:val="Normal"/>
+    <w:uiPriority w:val="39"/>
+    <w:semiHidden/>
+    <w:unhideWhenUsed/>
+    <w:pPr>
+      <w:spacing w:after="100"/>
+      <w:ind w:left="1540"/>
+    </w:pPr>
+  </w:style>
+  <w:style w:type="paragraph" w:styleId="TOC9">
+    <w:name w:val="toc 9"/>
+    <w:basedOn w:val="Normal"/>
+    <w:next w:val="Normal"/>
+    <w:uiPriority w:val="39"/>
+    <w:semiHidden/>
+    <w:unhideWhenUsed/>
+    <w:pPr>
+      <w:spacing w:after="100"/>
+      <w:ind w:left="1760"/>
+    </w:pPr>
+  </w:style>
   <w:style w:type="character" w:styleId="Hyperlink">
     <w:name w:val="Hyperlink"/>
     <w:basedOn w:val="DefaultParagraphFont"/>
@@ -6390,6 +6534,13 @@
       <w:sz w:val="20"/>
       <w:szCs w:val="20"/>
     </w:rPr>
+  </w:style>
+  <w:style w:type="character" w:styleId="LineNumber">
+    <w:name w:val="line number"/>
+    <w:basedOn w:val="DefaultParagraphFont"/>
+    <w:uiPriority w:val="99"/>
+    <w:semiHidden/>
+    <w:unhideWhenUsed/>
   </w:style>
   <w:style w:type="paragraph" w:styleId="Title">
     <w:name w:val="Title"/>

</xml_diff>